<commit_message>
Rework road model with dense navigation grid
</commit_message>
<xml_diff>
--- a/docs/report/Technical_Report_Intelligent_Navigation_UI.docx
+++ b/docs/report/Technical_Report_Intelligent_Navigation_UI.docx
@@ -604,14 +604,7 @@
         <w:spacing w:before="0" w:after="120" w:line="264" w:lineRule="auto"/>
       </w:pPr>
       <w:r>
-        <w:rPr>
-          <w:rFonts w:ascii="Calibri" w:hAnsi="Calibri" w:eastAsia="Calibri"/>
-          <w:b w:val="0"/>
-          <w:i w:val="0"/>
-          <w:color w:val="14232D"/>
-          <w:sz w:val="22"/>
-        </w:rPr>
-        <w:t>Only modeled roads are navigable. The implementation uses a manually defined road centerline network with an explicit width for each segment. This supports three project needs: road-validity checking for IV loading, automatic IV orientation alignment, and graph-based shortest path planning without MATLAB graph/shortestpath built-ins.</w:t>
+        <w:t>Only modeled roads are navigable. The implementation uses manually traced road corridors in map pixel coordinates, stored in RoadModelDataPx.m, with explicit width for each segment. The road corridors support IV legality checks and automatic IV orientation; path planning is performed on a dense 6 px navigable road grid with a custom A* search, avoiding MATLAB graph/shortestpath built-ins.</w:t>
       </w:r>
     </w:p>
     <w:p>
@@ -659,14 +652,7 @@
         <w:jc w:val="center"/>
       </w:pPr>
       <w:r>
-        <w:rPr>
-          <w:rFonts w:ascii="Calibri" w:hAnsi="Calibri" w:eastAsia="Calibri"/>
-          <w:b w:val="0"/>
-          <w:i/>
-          <w:color w:val="5A6469"/>
-          <w:sz w:val="19"/>
-        </w:rPr>
-        <w:t>Figure 1. Road centerline model overlaid on the provided campus map.</w:t>
+        <w:t>Figure 1. Corrected road corridor model and sampled 6 px navigable grid overlaid on the provided campus map.</w:t>
       </w:r>
     </w:p>
     <w:p>
@@ -2395,12 +2381,7 @@
               <w:spacing w:after="0" w:line="252" w:lineRule="auto"/>
             </w:pPr>
             <w:r>
-              <w:rPr>
-                <w:rFonts w:ascii="Calibri" w:hAnsi="Calibri" w:eastAsia="Calibri"/>
-                <w:color w:val="14232D"/>
-                <w:sz w:val="19"/>
-              </w:rPr>
-              <w:t>Path Plan mode accepts two arbitrary map points, snaps them to closest road points, computes a shortest road path with custom Dijkstra, and visualizes it.</w:t>
+              <w:t>Path Plan mode accepts two arbitrary map points, snaps them to closest road points, computes a shortest road path with a custom A* search on a dense 6 px navigable grid, and visualizes it.</w:t>
             </w:r>
           </w:p>
         </w:tc>
@@ -2488,14 +2469,7 @@
         <w:spacing w:before="0" w:after="120" w:line="264" w:lineRule="auto"/>
       </w:pPr>
       <w:r>
-        <w:rPr>
-          <w:rFonts w:ascii="Calibri" w:hAnsi="Calibri" w:eastAsia="Calibri"/>
-          <w:b w:val="0"/>
-          <w:i w:val="0"/>
-          <w:color w:val="14232D"/>
-          <w:sz w:val="22"/>
-        </w:rPr>
-        <w:t>When the user clicks to load an IV, the UI projects the clicked point onto every road segment and finds the closest segment. The selected point is valid only when the distance to that segment is within half of the road width. A valid IV is snapped to the road centerline so the visual result is clean and predictable.</w:t>
+        <w:t>When the user clicks to load an IV, the UI projects the clicked point onto every traced road-corridor segment and finds the closest segment. The selected point is valid only when the distance to that segment is within half of the corridor width. A valid IV is snapped to the closest road point so the visual result is clean and predictable.</w:t>
       </w:r>
     </w:p>
     <w:p>
@@ -2518,14 +2492,7 @@
         <w:spacing w:before="0" w:after="120" w:line="264" w:lineRule="auto"/>
       </w:pPr>
       <w:r>
-        <w:rPr>
-          <w:rFonts w:ascii="Calibri" w:hAnsi="Calibri" w:eastAsia="Calibri"/>
-          <w:b w:val="0"/>
-          <w:i w:val="0"/>
-          <w:color w:val="14232D"/>
-          <w:sz w:val="22"/>
-        </w:rPr>
-        <w:t>Path planning uses the same road network. Two clicked map points are snapped to their closest road points. Those snapped points are inserted into the road graph, then a custom Dijkstra procedure computes the shortest path. This avoids relying on MATLAB graph or shortestpath functions.</w:t>
+        <w:t>Path planning uses the traced road corridors plus a dense 6 px navigable grid. Two arbitrary clicked map points are snapped to their closest road points, then to nearby grid nodes. A custom A* procedure computes the shortest grid path, and the UI visualizes the result on the map. This improves fidelity on curves and intersections while still avoiding MATLAB graph or shortestpath functions.</w:t>
       </w:r>
     </w:p>
     <w:p>
@@ -2739,11 +2706,7 @@
               <w:spacing w:line="252" w:lineRule="auto" w:after="0"/>
             </w:pPr>
             <w:r>
-              <w:rPr>
-                <w:rFonts w:ascii="Calibri" w:hAnsi="Calibri"/>
-                <w:sz w:val="19"/>
-              </w:rPr>
-              <w:t>RunIntelligentNavigationUI.m contains UI creation, callbacks, road modeling, IV logic, measurement, optional functions, and custom shortest path code.</w:t>
+              <w:t>RunIntelligentNavigationUI.m contains UI creation, callbacks, IV logic, measurement, optional functions, and custom shortest path code; RoadModelDataPx.m stores the shared traced road-corridor model.</w:t>
             </w:r>
           </w:p>
         </w:tc>
@@ -3232,12 +3195,7 @@
               <w:spacing w:after="0" w:line="252" w:lineRule="auto"/>
             </w:pPr>
             <w:r>
-              <w:rPr>
-                <w:rFonts w:ascii="Calibri" w:hAnsi="Calibri" w:eastAsia="Calibri"/>
-                <w:color w:val="14232D"/>
-                <w:sz w:val="19"/>
-              </w:rPr>
-              <w:t>Road checking, rotation, and shortest path are implemented explicitly.</w:t>
+              <w:t>Road checking, rotation, 6 px grid construction, and A* shortest path are implemented explicitly.</w:t>
             </w:r>
           </w:p>
         </w:tc>

</xml_diff>

<commit_message>
Refine road annotations with 4px grid
</commit_message>
<xml_diff>
--- a/docs/report/Technical_Report_Intelligent_Navigation_UI.docx
+++ b/docs/report/Technical_Report_Intelligent_Navigation_UI.docx
@@ -604,7 +604,7 @@
         <w:spacing w:before="0" w:after="120" w:line="264" w:lineRule="auto"/>
       </w:pPr>
       <w:r>
-        <w:t>Only modeled roads are navigable. The implementation uses manually traced road corridors in map pixel coordinates, stored in RoadModelDataPx.m, with explicit width for each segment. The road corridors support IV legality checks and automatic IV orientation; path planning is performed on a dense 6 px navigable road grid with a custom A* search, avoiding MATLAB graph/shortestpath built-ins.</w:t>
+        <w:t>Only modeled roads are navigable. The implementation uses manually traced road corridors in map pixel coordinates, stored in RoadModelDataPx.m, with explicit width for each segment. The road corridors support IV legality checks and automatic IV orientation; path planning is performed on a dense 4 px navigable road grid with a custom A* search, avoiding MATLAB graph/shortestpath built-ins.</w:t>
       </w:r>
     </w:p>
     <w:p>
@@ -652,7 +652,7 @@
         <w:jc w:val="center"/>
       </w:pPr>
       <w:r>
-        <w:t>Figure 1. Corrected road corridor model and sampled 6 px navigable grid overlaid on the provided campus map.</w:t>
+        <w:t>Figure 1. Corrected road corridor model and sampled 4 px navigable grid overlaid on the provided campus map.</w:t>
       </w:r>
     </w:p>
     <w:p>
@@ -2381,7 +2381,7 @@
               <w:spacing w:after="0" w:line="252" w:lineRule="auto"/>
             </w:pPr>
             <w:r>
-              <w:t>Path Plan mode accepts two arbitrary map points, snaps them to closest road points, computes a shortest road path with a custom A* search on a dense 6 px navigable grid, and visualizes it.</w:t>
+              <w:t>Path Plan mode accepts two arbitrary map points, snaps them to closest road points, computes a shortest road path with a custom A* search on a dense 4 px navigable grid, and visualizes it.</w:t>
             </w:r>
           </w:p>
         </w:tc>
@@ -2492,7 +2492,7 @@
         <w:spacing w:before="0" w:after="120" w:line="264" w:lineRule="auto"/>
       </w:pPr>
       <w:r>
-        <w:t>Path planning uses the traced road corridors plus a dense 6 px navigable grid. Two arbitrary clicked map points are snapped to their closest road points, then to nearby grid nodes. A custom A* procedure computes the shortest grid path, and the UI visualizes the result on the map. This improves fidelity on curves and intersections while still avoiding MATLAB graph or shortestpath functions.</w:t>
+        <w:t>Path planning uses the traced road corridors plus a dense 4 px navigable grid. Two arbitrary clicked map points are snapped to their closest road points, then to nearby grid nodes. A custom A* procedure computes the shortest grid path, and the UI visualizes the result on the map. This improves fidelity on curves and intersections while still avoiding MATLAB graph or shortestpath functions.</w:t>
       </w:r>
     </w:p>
     <w:p>
@@ -3195,7 +3195,7 @@
               <w:spacing w:after="0" w:line="252" w:lineRule="auto"/>
             </w:pPr>
             <w:r>
-              <w:t>Road checking, rotation, 6 px grid construction, and A* shortest path are implemented explicitly.</w:t>
+              <w:t>Road checking, rotation, 4 px grid construction, and A* shortest path are implemented explicitly.</w:t>
             </w:r>
           </w:p>
         </w:tc>

</xml_diff>

<commit_message>
Extract green road corridors with width-aware grid
</commit_message>
<xml_diff>
--- a/docs/report/Technical_Report_Intelligent_Navigation_UI.docx
+++ b/docs/report/Technical_Report_Intelligent_Navigation_UI.docx
@@ -604,7 +604,7 @@
         <w:spacing w:before="0" w:after="120" w:line="264" w:lineRule="auto"/>
       </w:pPr>
       <w:r>
-        <w:t>Only modeled roads are navigable. The implementation uses manually traced road corridors in map pixel coordinates, stored in RoadModelDataPx.m, with explicit width for each segment. The road corridors support IV legality checks and automatic IV orientation; path planning is performed on a dense 4 px navigable road grid with a custom A* search, avoiding MATLAB graph/shortestpath built-ins.</w:t>
+        <w:t>Only modeled roads are navigable. The implementation uses #00FF00 green width-marked road corridors in map pixel coordinates, extracted offline, stored in RoadModelDataPx.m, with explicit width for each segment. The road corridors support IV legality checks and automatic IV orientation; path planning is performed on a dense 3 px navigable road grid with a custom A* search, avoiding MATLAB graph/shortestpath built-ins.</w:t>
       </w:r>
     </w:p>
     <w:p>
@@ -652,7 +652,7 @@
         <w:jc w:val="center"/>
       </w:pPr>
       <w:r>
-        <w:t>Figure 1. Corrected road corridor model and sampled 4 px navigable grid overlaid on the provided campus map.</w:t>
+        <w:t>Figure 1. Corrected road corridor model and sampled 3 px navigable grid overlaid on the provided campus map.</w:t>
       </w:r>
     </w:p>
     <w:p>
@@ -2289,7 +2289,7 @@
                 <w:color w:val="14232D"/>
                 <w:sz w:val="19"/>
               </w:rPr>
-              <w:t>Street View mode generates a simplified road-facing scene for a clicked road point and displays snapped coordinates and heading.</w:t>
+              <w:t>Street View mode generates a perspective-projected road-facing scene for a clicked road point, using the nearest road heading and extracted road width.</w:t>
             </w:r>
           </w:p>
         </w:tc>
@@ -2381,7 +2381,7 @@
               <w:spacing w:after="0" w:line="252" w:lineRule="auto"/>
             </w:pPr>
             <w:r>
-              <w:t>Path Plan mode accepts two arbitrary map points, snaps them to closest road points, computes a shortest road path with a custom A* search on a dense 4 px navigable grid, and visualizes it.</w:t>
+              <w:t>Path Plan mode accepts two arbitrary map points, snaps them to closest road points, computes a shortest road path with a custom A* search on a dense 3 px navigable grid, and visualizes it.</w:t>
             </w:r>
           </w:p>
         </w:tc>
@@ -2469,7 +2469,7 @@
         <w:spacing w:before="0" w:after="120" w:line="264" w:lineRule="auto"/>
       </w:pPr>
       <w:r>
-        <w:t>When the user clicks to load an IV, the UI projects the clicked point onto every traced road-corridor segment and finds the closest segment. The selected point is valid only when the distance to that segment is within half of the corridor width. A valid IV is snapped to the closest road point so the visual result is clean and predictable.</w:t>
+        <w:t>When the user clicks to load an IV, the UI projects the clicked point onto every extracted road-corridor segment and finds the closest segment. The selected point is valid only when the distance to that segment is within half of the corridor width. A valid IV is snapped to the closest road point so the visual result is clean and predictable.</w:t>
       </w:r>
     </w:p>
     <w:p>
@@ -2492,7 +2492,7 @@
         <w:spacing w:before="0" w:after="120" w:line="264" w:lineRule="auto"/>
       </w:pPr>
       <w:r>
-        <w:t>Path planning uses the traced road corridors plus a dense 4 px navigable grid. Two arbitrary clicked map points are snapped to their closest road points, then to nearby grid nodes. A custom A* procedure computes the shortest grid path, and the UI visualizes the result on the map. This improves fidelity on curves and intersections while still avoiding MATLAB graph or shortestpath functions.</w:t>
+        <w:t>Path planning uses the green width-marked road corridors plus a dense 3 px navigable grid. Two arbitrary clicked map points are snapped to their closest road points, then to nearby grid nodes. A custom A* procedure computes the shortest grid path, and the UI visualizes the result on the map. This improves fidelity on curves and intersections while still avoiding MATLAB graph or shortestpath functions.</w:t>
       </w:r>
     </w:p>
     <w:p>
@@ -2706,7 +2706,7 @@
               <w:spacing w:line="252" w:lineRule="auto" w:after="0"/>
             </w:pPr>
             <w:r>
-              <w:t>RunIntelligentNavigationUI.m contains UI creation, callbacks, IV logic, measurement, optional functions, and custom shortest path code; RoadModelDataPx.m stores the shared traced road-corridor model.</w:t>
+              <w:t>RunIntelligentNavigationUI.m contains UI creation, callbacks, IV logic, measurement, optional functions, and custom shortest path code; RoadModelDataPx.m stores the shared extracted road-corridor model.</w:t>
             </w:r>
           </w:p>
         </w:tc>
@@ -3195,7 +3195,7 @@
               <w:spacing w:after="0" w:line="252" w:lineRule="auto"/>
             </w:pPr>
             <w:r>
-              <w:t>Road checking, rotation, 4 px grid construction, and A* shortest path are implemented explicitly.</w:t>
+              <w:t>Road checking, rotation, 3 px grid construction, and A* shortest path are implemented explicitly.</w:t>
             </w:r>
           </w:p>
         </w:tc>

</xml_diff>